<commit_message>
Final cleanup: Equation Page contrast boost, Word docs refreshed, author to end
- Equation Page: lighter background, stronger text contrast, fixed column widths
- All Word docs regenerated from current md sources via pandoc
- PDFs removed (user regenerates from md)
- Author name moved to end of all documents (Szőke Barna)
- codes/ numbered 07-17 for Part III
- visuals/READMEv.docx added
- data/complete_results.md author line moved to end

Co-Authored-By: Claude Opus 4.6 (1M context) <noreply@anthropic.com>
</commit_message>
<xml_diff>
--- a/READMEP.docx
+++ b/READMEP.docx
@@ -2,7 +2,7 @@
 <file path=word/document.xml><?xml version="1.0" encoding="utf-8"?>
 <w:document xmlns:w="http://schemas.openxmlformats.org/wordprocessingml/2006/main" xmlns:m="http://schemas.openxmlformats.org/officeDocument/2006/math" xmlns:r="http://schemas.openxmlformats.org/officeDocument/2006/relationships" xmlns:o="urn:schemas-microsoft-com:office:office" xmlns:v="urn:schemas-microsoft-com:vml" xmlns:w10="urn:schemas-microsoft-com:office:word" xmlns:a="http://schemas.openxmlformats.org/drawingml/2006/main" xmlns:pic="http://schemas.openxmlformats.org/drawingml/2006/picture" xmlns:wp="http://schemas.openxmlformats.org/drawingml/2006/wordprocessingDrawing">
   <w:body>
-    <w:bookmarkStart w:id="44" w:name="mass-emergence-from-two-twistor-geometry"/>
+    <w:bookmarkStart w:id="45" w:name="mass-emergence-from-two-twistor-geometry"/>
     <w:p>
       <w:pPr>
         <w:pStyle w:val="Heading1"/>
@@ -23,24 +23,6 @@
     <w:p>
       <w:pPr>
         <w:pStyle w:val="FirstParagraph"/>
-      </w:pPr>
-      <w:r>
-        <w:rPr>
-          <w:b/>
-          <w:bCs/>
-        </w:rPr>
-        <w:t xml:space="preserve">Author:</w:t>
-      </w:r>
-      <w:r>
-        <w:t xml:space="preserve"> </w:t>
-      </w:r>
-      <w:r>
-        <w:t xml:space="preserve">Szőke Barna</w:t>
-      </w:r>
-    </w:p>
-    <w:p>
-      <w:pPr>
-        <w:pStyle w:val="BodyText"/>
       </w:pPr>
       <w:r>
         <w:rPr>
@@ -4916,8 +4898,373 @@
         <w:t xml:space="preserve">Dark Chandrasekhar limit at 0.7 M_sun (half of visible)</w:t>
       </w:r>
     </w:p>
+    <w:p>
+      <w:pPr>
+        <w:pStyle w:val="Compact"/>
+        <w:numPr>
+          <w:ilvl w:val="0"/>
+          <w:numId w:val="1007"/>
+        </w:numPr>
+      </w:pPr>
+      <w:r>
+        <w:t xml:space="preserve">Tensor-to-scalar ratio r = 1/169 = 1/13^2 = 0.00592 (testable by LiteBIRD ~2032)</w:t>
+      </w:r>
+    </w:p>
+    <w:p>
+      <w:pPr>
+        <w:pStyle w:val="Compact"/>
+        <w:numPr>
+          <w:ilvl w:val="0"/>
+          <w:numId w:val="1007"/>
+        </w:numPr>
+      </w:pPr>
+      <w:r>
+        <w:t xml:space="preserve">r is epoch-dependent: r(sigma) = (1/169)</w:t>
+      </w:r>
+      <w:r>
+        <w:rPr>
+          <w:i/>
+          <w:iCs/>
+        </w:rPr>
+        <w:t xml:space="preserve">exp(pi - 2</w:t>
+      </w:r>
+      <w:r>
+        <w:t xml:space="preserve">arctan(sigma/sigma_0))</w:t>
+      </w:r>
+    </w:p>
+    <w:p>
+      <w:pPr>
+        <w:pStyle w:val="Compact"/>
+        <w:numPr>
+          <w:ilvl w:val="0"/>
+          <w:numId w:val="1007"/>
+        </w:numPr>
+      </w:pPr>
+      <w:r>
+        <w:t xml:space="preserve">BH ringdown Q_220/Q_221 = 13/4 = 3.25 for ALL events (testable LIGO IR1, Sept 2026)</w:t>
+      </w:r>
+    </w:p>
+    <w:p>
+      <w:pPr>
+        <w:pStyle w:val="Compact"/>
+        <w:numPr>
+          <w:ilvl w:val="0"/>
+          <w:numId w:val="1007"/>
+        </w:numPr>
+      </w:pPr>
+      <w:r>
+        <w:t xml:space="preserve">Final BH spin (equal mass) = cos(45) = 1/sqrt(2) = 0.707</w:t>
+      </w:r>
+    </w:p>
+    <w:p>
+      <w:pPr>
+        <w:pStyle w:val="Compact"/>
+        <w:numPr>
+          <w:ilvl w:val="0"/>
+          <w:numId w:val="1007"/>
+        </w:numPr>
+      </w:pPr>
+      <w:r>
+        <w:t xml:space="preserve">CMB quadrupole suppression ~83% from counter-rotation cancellation</w:t>
+      </w:r>
+    </w:p>
+    <w:p>
+      <w:pPr>
+        <w:pStyle w:val="Compact"/>
+        <w:numPr>
+          <w:ilvl w:val="0"/>
+          <w:numId w:val="1007"/>
+        </w:numPr>
+      </w:pPr>
+      <w:r>
+        <w:t xml:space="preserve">GW amplitude ceiling = sin(30)*sin(pi/13) = 0.120</w:t>
+      </w:r>
+    </w:p>
     <w:bookmarkEnd w:id="39"/>
-    <w:bookmarkStart w:id="40" w:name="intellectual-foundations"/>
+    <w:bookmarkStart w:id="40" w:name="X378b69b381105fe8a334c1cd0a5dbffa4e46885"/>
+    <w:p>
+      <w:pPr>
+        <w:pStyle w:val="Heading2"/>
+      </w:pPr>
+      <w:r>
+        <w:t xml:space="preserve">Part III: Poinsot Geometry and Gravitational Waves</w:t>
+      </w:r>
+    </w:p>
+    <w:p>
+      <w:pPr>
+        <w:pStyle w:val="FirstParagraph"/>
+      </w:pPr>
+      <w:r>
+        <w:t xml:space="preserve">The single-cone framework (one cone, two counter-rotating hemispheres)</w:t>
+      </w:r>
+      <w:r>
+        <w:t xml:space="preserve"> </w:t>
+      </w:r>
+      <w:r>
+        <w:t xml:space="preserve">reveals three geometric thresholds at exact rational inertia ratios:</w:t>
+      </w:r>
+    </w:p>
+    <w:tbl>
+      <w:tblPr>
+        <w:tblStyle w:val="Table"/>
+        <w:tblW w:type="auto" w:w="0"/>
+        <w:tblLook w:firstRow="1" w:lastRow="0" w:firstColumn="0" w:lastColumn="0" w:noHBand="0" w:noVBand="0" w:val="0020"/>
+      </w:tblPr>
+      <w:tblGrid>
+        <w:gridCol w:w="2640"/>
+        <w:gridCol w:w="2640"/>
+        <w:gridCol w:w="2640"/>
+      </w:tblGrid>
+      <w:tr>
+        <w:trPr>
+          <w:tblHeader w:val="on"/>
+        </w:trPr>
+        <w:tc>
+          <w:tcPr/>
+          <w:p>
+            <w:pPr>
+              <w:pStyle w:val="Compact"/>
+            </w:pPr>
+            <w:r>
+              <w:t xml:space="preserve">Angle</w:t>
+            </w:r>
+          </w:p>
+        </w:tc>
+        <w:tc>
+          <w:tcPr/>
+          <w:p>
+            <w:pPr>
+              <w:pStyle w:val="Compact"/>
+            </w:pPr>
+            <w:r>
+              <w:t xml:space="preserve">I1/I3</w:t>
+            </w:r>
+          </w:p>
+        </w:tc>
+        <w:tc>
+          <w:tcPr/>
+          <w:p>
+            <w:pPr>
+              <w:pStyle w:val="Compact"/>
+            </w:pPr>
+            <w:r>
+              <w:t xml:space="preserve">Significance</w:t>
+            </w:r>
+          </w:p>
+        </w:tc>
+      </w:tr>
+      <w:tr>
+        <w:tc>
+          <w:tcPr/>
+          <w:p>
+            <w:pPr>
+              <w:pStyle w:val="Compact"/>
+            </w:pPr>
+            <w:r>
+              <w:t xml:space="preserve">60 deg</w:t>
+            </w:r>
+          </w:p>
+        </w:tc>
+        <w:tc>
+          <w:tcPr/>
+          <w:p>
+            <w:pPr>
+              <w:pStyle w:val="Compact"/>
+            </w:pPr>
+            <w:r>
+              <w:t xml:space="preserve">7/6</w:t>
+            </w:r>
+          </w:p>
+        </w:tc>
+        <w:tc>
+          <w:tcPr/>
+          <w:p>
+            <w:pPr>
+              <w:pStyle w:val="Compact"/>
+            </w:pPr>
+            <w:r>
+              <w:t xml:space="preserve">BE-shifted spherical point</w:t>
+            </w:r>
+          </w:p>
+        </w:tc>
+      </w:tr>
+      <w:tr>
+        <w:tc>
+          <w:tcPr/>
+          <w:p>
+            <w:pPr>
+              <w:pStyle w:val="Compact"/>
+            </w:pPr>
+            <w:r>
+              <w:t xml:space="preserve">45 deg</w:t>
+            </w:r>
+          </w:p>
+        </w:tc>
+        <w:tc>
+          <w:tcPr/>
+          <w:p>
+            <w:pPr>
+              <w:pStyle w:val="Compact"/>
+            </w:pPr>
+            <w:r>
+              <w:t xml:space="preserve">5/2</w:t>
+            </w:r>
+          </w:p>
+        </w:tc>
+        <w:tc>
+          <w:tcPr/>
+          <w:p>
+            <w:pPr>
+              <w:pStyle w:val="Compact"/>
+            </w:pPr>
+            <w:r>
+              <w:t xml:space="preserve">Contact angle</w:t>
+            </w:r>
+          </w:p>
+        </w:tc>
+      </w:tr>
+      <w:tr>
+        <w:tc>
+          <w:tcPr/>
+          <w:p>
+            <w:pPr>
+              <w:pStyle w:val="Compact"/>
+            </w:pPr>
+            <w:r>
+              <w:t xml:space="preserve">30 deg</w:t>
+            </w:r>
+          </w:p>
+        </w:tc>
+        <w:tc>
+          <w:tcPr/>
+          <w:p>
+            <w:pPr>
+              <w:pStyle w:val="Compact"/>
+            </w:pPr>
+            <w:r>
+              <w:t xml:space="preserve">13/2</w:t>
+            </w:r>
+          </w:p>
+        </w:tc>
+        <w:tc>
+          <w:tcPr/>
+          <w:p>
+            <w:pPr>
+              <w:pStyle w:val="Compact"/>
+            </w:pPr>
+            <w:r>
+              <w:t xml:space="preserve">Equilateral stabilization</w:t>
+            </w:r>
+          </w:p>
+        </w:tc>
+      </w:tr>
+    </w:tbl>
+    <w:p>
+      <w:pPr>
+        <w:pStyle w:val="BodyText"/>
+      </w:pPr>
+      <w:r>
+        <w:t xml:space="preserve">The counter-rotation brakes due to Bose-Einstein density asymmetry</w:t>
+      </w:r>
+      <w:r>
+        <w:t xml:space="preserve"> </w:t>
+      </w:r>
+      <w:r>
+        <w:t xml:space="preserve">(P(identical rho) = 0). Braking energy = torsion = gravity. Final</w:t>
+      </w:r>
+      <w:r>
+        <w:t xml:space="preserve"> </w:t>
+      </w:r>
+      <w:r>
+        <w:t xml:space="preserve">state: only precession remains (no spin). Graviton energy = 3.78 GeV/cone.</w:t>
+      </w:r>
+    </w:p>
+    <w:p>
+      <w:pPr>
+        <w:pStyle w:val="BodyText"/>
+      </w:pPr>
+      <w:r>
+        <w:rPr>
+          <w:b/>
+          <w:bCs/>
+        </w:rPr>
+        <w:t xml:space="preserve">GW250114 retrodict</w:t>
+      </w:r>
+      <w:r>
+        <w:t xml:space="preserve"> </w:t>
+      </w:r>
+      <w:r>
+        <w:t xml:space="preserve">(Jan 14, 2025, PRL Jan 29, 2026):</w:t>
+      </w:r>
+      <w:r>
+        <w:t xml:space="preserve"> </w:t>
+      </w:r>
+      <w:r>
+        <w:t xml:space="preserve">- Q_220/Q_221: predicted 13/4 = 3.250, measured 3.231 (99.4% match)</w:t>
+      </w:r>
+      <w:r>
+        <w:t xml:space="preserve"> </w:t>
+      </w:r>
+      <w:r>
+        <w:t xml:space="preserve">- Final spin: predicted cos(45) = 0.707, measured 0.69 (97.6% match)</w:t>
+      </w:r>
+      <w:r>
+        <w:t xml:space="preserve"> </w:t>
+      </w:r>
+      <w:r>
+        <w:t xml:space="preserve">- Frequency f_220: predicted 251 Hz, measured 251 Hz (exact)</w:t>
+      </w:r>
+    </w:p>
+    <w:p>
+      <w:pPr>
+        <w:pStyle w:val="BodyText"/>
+      </w:pPr>
+      <w:r>
+        <w:rPr>
+          <w:b/>
+          <w:bCs/>
+        </w:rPr>
+        <w:t xml:space="preserve">Problems resolved in Part III (34-39):</w:t>
+      </w:r>
+      <w:r>
+        <w:t xml:space="preserve"> </w:t>
+      </w:r>
+      <w:r>
+        <w:t xml:space="preserve">34. Causality in (2,3) signature — constraint prevents CTC</w:t>
+      </w:r>
+      <w:r>
+        <w:t xml:space="preserve"> </w:t>
+      </w:r>
+      <w:r>
+        <w:t xml:space="preserve">35. Poinsot duality — classical mechanics = quantum mass emergence</w:t>
+      </w:r>
+      <w:r>
+        <w:t xml:space="preserve"> </w:t>
+      </w:r>
+      <w:r>
+        <w:t xml:space="preserve">36. Irreversibility — birth = local entropy decrease</w:t>
+      </w:r>
+      <w:r>
+        <w:t xml:space="preserve"> </w:t>
+      </w:r>
+      <w:r>
+        <w:t xml:space="preserve">37. Symmetry breaking — occurs in entropy, not space</w:t>
+      </w:r>
+      <w:r>
+        <w:t xml:space="preserve"> </w:t>
+      </w:r>
+      <w:r>
+        <w:t xml:space="preserve">38. Gravity origin — braking energy of counter-rotation</w:t>
+      </w:r>
+      <w:r>
+        <w:t xml:space="preserve"> </w:t>
+      </w:r>
+      <w:r>
+        <w:t xml:space="preserve">39. SMBH formation — precession snapshots, not accreted objects</w:t>
+      </w:r>
+    </w:p>
+    <w:bookmarkEnd w:id="40"/>
+    <w:bookmarkStart w:id="41" w:name="intellectual-foundations"/>
     <w:p>
       <w:pPr>
         <w:pStyle w:val="Heading2"/>
@@ -5021,8 +5368,8 @@
         </w:pict>
       </w:r>
     </w:p>
-    <w:bookmarkEnd w:id="40"/>
-    <w:bookmarkStart w:id="41" w:name="repository-structure"/>
+    <w:bookmarkEnd w:id="41"/>
+    <w:bookmarkStart w:id="42" w:name="repository-structure"/>
     <w:p>
       <w:pPr>
         <w:pStyle w:val="Heading2"/>
@@ -5039,7 +5386,7 @@
         <w:rPr>
           <w:rStyle w:val="VerbatimChar"/>
         </w:rPr>
-        <w:t xml:space="preserve">DOCUMENTATION_INDEX.md  - Complete intellectual lineage and 23 original innovations</w:t>
+        <w:t xml:space="preserve">paper/          - Papers (PAPER.md/docx/pdf, PAPER_II, PAPER_III)</w:t>
       </w:r>
       <w:r>
         <w:br/>
@@ -5048,7 +5395,7 @@
         <w:rPr>
           <w:rStyle w:val="VerbatimChar"/>
         </w:rPr>
-        <w:t xml:space="preserve">paper/          - Papers (PAPER.md/docx/pdf, PAPER_II.md/docx/pdf)</w:t>
+        <w:t xml:space="preserve">algebra/        - Algebraic foundations (13 documents + DOCUMENTATION_INDEX)</w:t>
       </w:r>
       <w:r>
         <w:br/>
@@ -5057,7 +5404,7 @@
         <w:rPr>
           <w:rStyle w:val="VerbatimChar"/>
         </w:rPr>
-        <w:t xml:space="preserve">algebra/        - Algebraic foundation documents (13 documents)</w:t>
+        <w:t xml:space="preserve">codes/          - Computational codes</w:t>
       </w:r>
       <w:r>
         <w:br/>
@@ -5066,7 +5413,7 @@
         <w:rPr>
           <w:rStyle w:val="VerbatimChar"/>
         </w:rPr>
-        <w:t xml:space="preserve">                  Pin covers, Compartment Algebra, Bockstein bridge,</w:t>
+        <w:t xml:space="preserve">                  01-06_*.py  Part I (quarks, couplings, leptons, cosmology)</w:t>
       </w:r>
       <w:r>
         <w:br/>
@@ -5075,7 +5422,7 @@
         <w:rPr>
           <w:rStyle w:val="VerbatimChar"/>
         </w:rPr>
-        <w:t xml:space="preserve">                  VO+(4,2), PG(5,2), Fano-E8, Penrose Transform,</w:t>
+        <w:t xml:space="preserve">                  compute_*.js  Part II (dark sector, Maxwell, Schrodinger)</w:t>
       </w:r>
       <w:r>
         <w:br/>
@@ -5084,7 +5431,7 @@
         <w:rPr>
           <w:rStyle w:val="VerbatimChar"/>
         </w:rPr>
-        <w:t xml:space="preserve">                  Bundle Structure, Extension sequence</w:t>
+        <w:t xml:space="preserve">                  07-17_*.py  Part III (Poinsot, braking, BH, GW, CMB, BE)</w:t>
       </w:r>
       <w:r>
         <w:br/>
@@ -5093,7 +5440,7 @@
         <w:rPr>
           <w:rStyle w:val="VerbatimChar"/>
         </w:rPr>
-        <w:t xml:space="preserve">codes/          - Computational codes (Python + JavaScript)</w:t>
+        <w:t xml:space="preserve">data/           - Numerical results (complete_results.md/docx/pdf)</w:t>
       </w:r>
       <w:r>
         <w:br/>
@@ -5102,7 +5449,7 @@
         <w:rPr>
           <w:rStyle w:val="VerbatimChar"/>
         </w:rPr>
-        <w:t xml:space="preserve">                  01-06_*.py (original computations)</w:t>
+        <w:t xml:space="preserve">visuals/        - Interactive visualizations (HTML, JSX, PNG)</w:t>
       </w:r>
       <w:r>
         <w:br/>
@@ -5111,7 +5458,7 @@
         <w:rPr>
           <w:rStyle w:val="VerbatimChar"/>
         </w:rPr>
-        <w:t xml:space="preserve">                  compute_*.js (dark sector, Maxwell, Schrodinger, etc.)</w:t>
+        <w:t xml:space="preserve">                  Equation poster, CMB modulation, results charts,</w:t>
       </w:r>
       <w:r>
         <w:br/>
@@ -5120,52 +5467,7 @@
         <w:rPr>
           <w:rStyle w:val="VerbatimChar"/>
         </w:rPr>
-        <w:t xml:space="preserve">data/           - Numerical results (complete_results.md/docx/pdf,</w:t>
-      </w:r>
-      <w:r>
-        <w:br/>
-      </w:r>
-      <w:r>
-        <w:rPr>
-          <w:rStyle w:val="VerbatimChar"/>
-        </w:rPr>
-        <w:t xml:space="preserve">                  Unified_Mass_Table.xlsx)</w:t>
-      </w:r>
-      <w:r>
-        <w:br/>
-      </w:r>
-      <w:r>
-        <w:rPr>
-          <w:rStyle w:val="VerbatimChar"/>
-        </w:rPr>
-        <w:t xml:space="preserve">visuals/        - Interactive visualizations (10 files)</w:t>
-      </w:r>
-      <w:r>
-        <w:br/>
-      </w:r>
-      <w:r>
-        <w:rPr>
-          <w:rStyle w:val="VerbatimChar"/>
-        </w:rPr>
-        <w:t xml:space="preserve">                  HTML: equation poster, results charts, graph hierarchy,</w:t>
-      </w:r>
-      <w:r>
-        <w:br/>
-      </w:r>
-      <w:r>
-        <w:rPr>
-          <w:rStyle w:val="VerbatimChar"/>
-        </w:rPr>
-        <w:t xml:space="preserve">                  spacetime, four cones, step-out angle diagram</w:t>
-      </w:r>
-      <w:r>
-        <w:br/>
-      </w:r>
-      <w:r>
-        <w:rPr>
-          <w:rStyle w:val="VerbatimChar"/>
-        </w:rPr>
-        <w:t xml:space="preserve">                  JSX: cone rotation, precession lab, precession hierarchy</w:t>
+        <w:t xml:space="preserve">                  cone geometry, Poinsot 3D, Bose-Einstein plots</w:t>
       </w:r>
     </w:p>
     <w:p>
@@ -5175,8 +5477,8 @@
         </w:pict>
       </w:r>
     </w:p>
-    <w:bookmarkEnd w:id="41"/>
-    <w:bookmarkStart w:id="42" w:name="on-the-nature-of-the-predictions"/>
+    <w:bookmarkEnd w:id="42"/>
+    <w:bookmarkStart w:id="43" w:name="on-the-nature-of-the-predictions"/>
     <w:p>
       <w:pPr>
         <w:pStyle w:val="Heading2"/>
@@ -5290,8 +5592,8 @@
         </w:pict>
       </w:r>
     </w:p>
-    <w:bookmarkEnd w:id="42"/>
-    <w:bookmarkStart w:id="43" w:name="license"/>
+    <w:bookmarkEnd w:id="43"/>
+    <w:bookmarkStart w:id="44" w:name="license"/>
     <w:p>
       <w:pPr>
         <w:pStyle w:val="Heading2"/>
@@ -5305,7 +5607,7 @@
         <w:pStyle w:val="FirstParagraph"/>
       </w:pPr>
       <w:r>
-        <w:t xml:space="preserve">All rights reserved. Copyright 2026 Szőke Barna.</w:t>
+        <w:t xml:space="preserve">All rights reserved. Copyright 2026.</w:t>
       </w:r>
     </w:p>
     <w:p>
@@ -5316,8 +5618,49 @@
         <w:t xml:space="preserve">Prior art established by this repository’s git commit timestamps.</w:t>
       </w:r>
     </w:p>
-    <w:bookmarkEnd w:id="43"/>
+    <w:p>
+      <w:r>
+        <w:pict>
+          <v:rect style="width:0;height:1.5pt" o:hralign="center" o:hrstd="t" o:hr="t"/>
+        </w:pict>
+      </w:r>
+    </w:p>
+    <w:p>
+      <w:pPr>
+        <w:pStyle w:val="FirstParagraph"/>
+      </w:pPr>
+      <w:r>
+        <w:rPr>
+          <w:b/>
+          <w:bCs/>
+        </w:rPr>
+        <w:t xml:space="preserve">Author:</w:t>
+      </w:r>
+      <w:r>
+        <w:t xml:space="preserve"> </w:t>
+      </w:r>
+      <w:r>
+        <w:t xml:space="preserve">Szőke Barna</w:t>
+      </w:r>
+      <w:r>
+        <w:t xml:space="preserve"> </w:t>
+      </w:r>
+      <w:r>
+        <w:rPr>
+          <w:b/>
+          <w:bCs/>
+        </w:rPr>
+        <w:t xml:space="preserve">DOI:</w:t>
+      </w:r>
+      <w:r>
+        <w:t xml:space="preserve"> </w:t>
+      </w:r>
+      <w:r>
+        <w:t xml:space="preserve">10.5281/zenodo.19140795</w:t>
+      </w:r>
+    </w:p>
     <w:bookmarkEnd w:id="44"/>
+    <w:bookmarkEnd w:id="45"/>
     <w:sectPr>
       <w:footnotePr>
         <w:numRestart w:val="eachSect"/>

</xml_diff>